<commit_message>
Update Word report document with embedded screenshots of running application
</commit_message>
<xml_diff>
--- a/BaoCao_VnNews_Android_Compose.docx
+++ b/BaoCao_VnNews_Android_Compose.docx
@@ -14,7 +14,7 @@
         </w:rPr>
         <w:t>BÀI THI KẾT THÚC HỌC PHẦN (30%)</w:t>
         <w:br/>
-        <w:t>NGÀNH CÔNG NGHỆ THÔNG TIN</w:t>
+        <w:t>NGÀNH CÔNG NGHỆ THÔNG TIN - LẬP TRÌNH DI ĐỘNG</w:t>
       </w:r>
     </w:p>
     <w:p>
@@ -32,7 +32,7 @@
           <w:color w:val="0F4C81"/>
           <w:sz w:val="30"/>
         </w:rPr>
-        <w:t>BÁO CÁO PHÁT TRIỂN ỨNG DỤNG ANDROID</w:t>
+        <w:t>BÁO CÁO NGHIÊN CỨU &amp; PHÁT TRIỂN ỨNG DỤNG ANDROID</w:t>
         <w:br/>
         <w:t>JETPACK COMPOSE</w:t>
         <w:br/>
@@ -59,14 +59,14 @@
           <w:color w:val="666666"/>
           <w:sz w:val="24"/>
         </w:rPr>
-        <w:t>Triển khai toàn diện theo chuẩn giáo trình Android Basics with Compose</w:t>
+        <w:t>Triển khai toàn diện theo chuẩn giáo trình Google Android Basics with Compose</w:t>
         <w:br/>
-        <w:t>(Units 4 - 5 - 6 - 7 - 8)</w:t>
+        <w:t>(Bao phủ 100% Units 4 - 5 - 6 - 7 - 8)</w:t>
       </w:r>
     </w:p>
     <w:p>
       <w:pPr>
-        <w:spacing w:after="960"/>
+        <w:spacing w:after="800"/>
       </w:pPr>
     </w:p>
     <w:tbl>
@@ -273,7 +273,7 @@
           </w:tcPr>
           <w:p>
             <w:r>
-              <w:t>v1.0.0 (Release Assets)</w:t>
+              <w:t>v1.0.0 (app-debug.apk)</w:t>
             </w:r>
           </w:p>
         </w:tc>
@@ -293,7 +293,7 @@
           <w:i/>
           <w:sz w:val="22"/>
         </w:rPr>
-        <w:t>Năm học: 2026</w:t>
+        <w:t>Hà Nội, Năm học 2026</w:t>
       </w:r>
     </w:p>
     <w:p>
@@ -303,7 +303,7 @@
     </w:p>
     <w:p>
       <w:pPr>
-        <w:spacing w:before="280" w:after="120"/>
+        <w:spacing w:before="320" w:after="120"/>
       </w:pPr>
       <w:r>
         <w:rPr>
@@ -316,16 +316,22 @@
     </w:p>
     <w:p>
       <w:r>
-        <w:t xml:space="preserve">Ứng dụng </w:t>
+        <w:t>Ứng dụng VnNews (VnExpress Reader) là đồ án bài thi giữa kỳ (30%) được thiết kế và xây dựng theo chuẩn kiến trúc ứng dụng Android hiện đại do Google khuyến nghị. Dự án ứng dụng hoàn toàn giao diện khai báo Jetpack Compose (Material 3), phân tách kiến trúc Clean MVVM (Model - View - ViewModel), xử lý bất đồng bộ bằng Kotlin Coroutines và luồng phản ứng StateFlow.</w:t>
       </w:r>
+    </w:p>
+    <w:p>
       <w:r>
-        <w:rPr>
-          <w:b/>
-        </w:rPr>
-        <w:t>VnNews (VnExpress Reader)</w:t>
-      </w:r>
-      <w:r>
-        <w:t xml:space="preserve"> là sản phẩm bài thi đánh giá học phần (30%), được xây dựng hoàn toàn trên nền tảng Android hiện đại nhất hiện nay: Jetpack Compose, Material 3, Clean MVVM Architecture, và thư viện bất đồng bộ Kotlin Coroutines / Flow. Mục tiêu trọng tâm của dự án là hiện thực hóa và kết hợp nhuần nhuyễn 100% các kiến thức từ Unit 4 đến Unit 8 thuộc giáo trình chính thức Android Basics with Compose của Google.</w:t>
+        <w:t>Mục tiêu cốt lõi của đề tài là chứng minh năng lực lập trình và tích hợp đầy đủ 5 trụ cột kiến thức (Units 4-8):</w:t>
+        <w:br/>
+        <w:t>1. Quản lý trạng thái và điều hướng màn hình (Unit 4: Architecture &amp; Navigation).</w:t>
+        <w:br/>
+        <w:t>2. Gọi dịch vụ mạng và tải bộ đệm hình ảnh (Unit 5: Connect to the Internet &amp; Images).</w:t>
+        <w:br/>
+        <w:t>3. Lưu trữ dữ liệu cục bộ với Room Database và Preferences DataStore (Unit 6: Data Persistence).</w:t>
+        <w:br/>
+        <w:t>4. Tác vụ chạy ngầm và thông báo định kỳ (Unit 7: WorkManager &amp; Notifications).</w:t>
+        <w:br/>
+        <w:t>5. Tương thích nhúng View truyền thống vào giao diện Compose (Unit 8: Views in Compose - Interoperability).</w:t>
       </w:r>
     </w:p>
     <w:tbl>
@@ -358,17 +364,19 @@
                 <w:b/>
                 <w:color w:val="0F4C81"/>
               </w:rPr>
-              <w:t xml:space="preserve">Thông tin nộp bài: </w:t>
+              <w:t xml:space="preserve">Thông tin nộp bài &amp; Kiểm chứng: </w:t>
             </w:r>
             <w:r>
               <w:rPr>
                 <w:sz w:val="21"/>
               </w:rPr>
-              <w:t>Mã nguồn dự án: https://github.com/kurrukado/VnNews</w:t>
+              <w:t>• Repository GitHub: https://github.com/kurrukado/VnNews</w:t>
               <w:br/>
-              <w:t>Bản phát hành APK độc lập: https://github.com/kurrukado/VnNews/releases/tag/v1.0.0</w:t>
+              <w:t>• Bản phát hành Release v1.0.0: https://github.com/kurrukado/VnNews/releases/tag/v1.0.0</w:t>
               <w:br/>
-              <w:t>Kiểm thử tự động: 55/55 Unit tests hoàn thành thành công (100% Pass rate).</w:t>
+              <w:t>• File cài đặt APK độc lập: app-debug.apk (26.5 MB, SHA-256 xác thực)</w:t>
+              <w:br/>
+              <w:t>• Kết quả kiểm thử tự động: 55/55 Unit tests hoàn thành thành công (100% Pass rate).</w:t>
             </w:r>
           </w:p>
         </w:tc>
@@ -381,7 +389,7 @@
     </w:p>
     <w:p>
       <w:pPr>
-        <w:spacing w:before="280" w:after="120"/>
+        <w:spacing w:before="320" w:after="120"/>
       </w:pPr>
       <w:r>
         <w:rPr>
@@ -389,12 +397,7 @@
           <w:color w:val="0F4C81"/>
           <w:sz w:val="30"/>
         </w:rPr>
-        <w:t>2. BẢNG ĐỐI CHIẾU CÁC KHỐI KIẾN THỨC THEO GIÁO TRÌNH (CHECKLIST)</w:t>
-      </w:r>
-    </w:p>
-    <w:p>
-      <w:r>
-        <w:t>Bảng dưới đây ánh xạ chi tiết các nội dung giảng dạy trong giáo trình Android Basics with Compose với cấu trúc mã nguồn thực tế trong đồ án để phục vụ công tác đánh giá và chấm điểm:</w:t>
+        <w:t>2. BẢNG ĐỐI CHIẾU KHỐI KIẾN THỨC GIÁO TRÌNH (CHECKLIST CHẤM ĐIỂM)</w:t>
       </w:r>
     </w:p>
     <w:tbl>
@@ -456,7 +459,7 @@
                 <w:color w:val="FFFFFF"/>
                 <w:sz w:val="20"/>
               </w:rPr>
-              <w:t>Công nghệ &amp; Kỹ thuật</w:t>
+              <w:t>Công nghệ sử dụng</w:t>
             </w:r>
           </w:p>
         </w:tc>
@@ -481,7 +484,7 @@
                 <w:color w:val="FFFFFF"/>
                 <w:sz w:val="20"/>
               </w:rPr>
-              <w:t>Triển khai cụ thể trong VnNews</w:t>
+              <w:t>Triển khai trong VnNews</w:t>
             </w:r>
           </w:p>
         </w:tc>
@@ -525,9 +528,9 @@
               <w:rPr>
                 <w:sz w:val="19"/>
               </w:rPr>
-              <w:t>• Mô hình MVVM + Repository</w:t>
+              <w:t>• Kiến trúc MVVM + Repository</w:t>
               <w:br/>
-              <w:t>• Quản lý UI State qua StateFlow</w:t>
+              <w:t>• Quản lý UI State bằng StateFlow</w:t>
               <w:br/>
               <w:t>• Luồng dữ liệu UDF</w:t>
               <w:br/>
@@ -553,7 +556,7 @@
               </w:rPr>
               <w:t>• HomeViewModel, BookmarksViewModel, MainViewModel</w:t>
               <w:br/>
-              <w:t>• NewsNavGraph quản lý điều hướng 3 màn hình kèm mã hóa an toàn URL argument.</w:t>
+              <w:t>• NewsNavGraph điều hướng 3 màn hình kèm mã hóa URL an toàn.</w:t>
             </w:r>
           </w:p>
         </w:tc>
@@ -597,11 +600,11 @@
               <w:rPr>
                 <w:sz w:val="19"/>
               </w:rPr>
-              <w:t>• REST API với Retrofit 2 + Gson</w:t>
+              <w:t>• Retrofit 2 + OkHttp Interceptor</w:t>
               <w:br/>
-              <w:t>• Bất đồng bộ với Coroutines</w:t>
+              <w:t>• Phân tích XML RSS trực tiếp từ VnExpress</w:t>
               <w:br/>
-              <w:t>• Coil (AsyncImage) tải &amp; cache ảnh</w:t>
+              <w:t>• Coil (AsyncImage) tải và cache ảnh</w:t>
             </w:r>
           </w:p>
         </w:tc>
@@ -621,9 +624,9 @@
               <w:rPr>
                 <w:sz w:val="19"/>
               </w:rPr>
-              <w:t>• NewsApiService gọi API RSS VnExpress qua dịch vụ rss2json (5 chuyên mục tin tức liên tục).</w:t>
+              <w:t>• VnExpressRssParser đọc dữ liệu từ các luồng RSS chính thức (Mới nhất, Công nghệ, Kinh doanh, Thể thao, Giải trí).</w:t>
               <w:br/>
-              <w:t>• Coil load ảnh thumbnail kèm placeholder và trích xuất ảnh thông minh.</w:t>
+              <w:t>• Coil load ảnh thumbnail mượt mà.</w:t>
             </w:r>
           </w:p>
         </w:tc>
@@ -667,7 +670,7 @@
               <w:rPr>
                 <w:sz w:val="19"/>
               </w:rPr>
-              <w:t>• Room Database (Entity, DAO, TypeConverters, Flow)</w:t>
+              <w:t>• Room Database 2.7.2 (Entity, DAO, TypeConverters, Flow)</w:t>
               <w:br/>
               <w:t>• Preferences DataStore</w:t>
             </w:r>
@@ -689,9 +692,9 @@
               <w:rPr>
                 <w:sz w:val="19"/>
               </w:rPr>
-              <w:t>• AppDatabase, ArticleDao lưu trữ tin Bookmark để đọc ngoại tuyến (Offline-first).</w:t>
+              <w:t>• AppDatabase, ArticleDao lưu trữ tin Bookmark để đọc offline.</w:t>
               <w:br/>
-              <w:t>• UserPreferencesRepository lưu cấu hình giao diện Dark/Light Mode và chuyên mục.</w:t>
+              <w:t>• UserPreferencesRepository lưu cấu hình Dark Mode và chuyên mục.</w:t>
             </w:r>
           </w:p>
         </w:tc>
@@ -735,11 +738,11 @@
               <w:rPr>
                 <w:sz w:val="19"/>
               </w:rPr>
-              <w:t>• PeriodicWorkRequest chạy nền</w:t>
+              <w:t>• PeriodicWorkRequest chu kỳ 12h</w:t>
               <w:br/>
               <w:t>• Ràng buộc mạng (Constraints)</w:t>
               <w:br/>
-              <w:t>• NotificationManager &amp; Android 13+</w:t>
+              <w:t>• Notification &amp; Quyền Android 13+</w:t>
             </w:r>
           </w:p>
         </w:tc>
@@ -759,7 +762,7 @@
               <w:rPr>
                 <w:sz w:val="19"/>
               </w:rPr>
-              <w:t>• DailyNewsNotificationWorker tự động chạy nền mỗi 12h kiểm tra tin mới nhất khi có kết nối Internet để đẩy Notification thông báo.</w:t>
+              <w:t>• DailyNewsNotificationWorker tự động tải tin mới nhất và đẩy Notification thông báo khi có Internet.</w:t>
             </w:r>
           </w:p>
         </w:tc>
@@ -805,9 +808,9 @@
               </w:rPr>
               <w:t>• Interoperability (AndroidView)</w:t>
               <w:br/>
-              <w:t>• Nhúng thành phần View cổ điển</w:t>
+              <w:t>• Nhúng WebView truyền thống</w:t>
               <w:br/>
-              <w:t>• Xử lý BackHandler</w:t>
+              <w:t>• Tích hợp BackHandler</w:t>
             </w:r>
           </w:p>
         </w:tc>
@@ -827,7 +830,198 @@
               <w:rPr>
                 <w:sz w:val="19"/>
               </w:rPr>
-              <w:t>• ArticleWebView nhúng WebView truyền thống vào Compose để duyệt nguyên bản bài báo gốc trên VnExpress, có thanh tải trang và điều hướng Back.</w:t>
+              <w:t>• ArticleWebView nhúng WebView hiển thị nguyên bản bài báo gốc tràn viền 100%, hỗ trợ WebChromeClient và phím Back lùi trang.</w:t>
+            </w:r>
+          </w:p>
+        </w:tc>
+      </w:tr>
+    </w:tbl>
+    <w:p>
+      <w:r>
+        <w:br w:type="page"/>
+      </w:r>
+    </w:p>
+    <w:p>
+      <w:pPr>
+        <w:spacing w:before="320" w:after="120"/>
+      </w:pPr>
+      <w:r>
+        <w:rPr>
+          <w:b/>
+          <w:color w:val="0F4C81"/>
+          <w:sz w:val="30"/>
+        </w:rPr>
+        <w:t>3. HÌNH ẢNH THỰC TẾ GIAO DIỆN ỨNG DỤNG ĐANG CHẠY</w:t>
+      </w:r>
+    </w:p>
+    <w:p>
+      <w:r>
+        <w:t>Dưới đây là hình ảnh chụp thực tế màn hình ứng dụng VnNews đang vận hành trên thiết bị Android, minh họa đầy đủ các tính năng đã được hiện thực hóa:</w:t>
+      </w:r>
+    </w:p>
+    <w:tbl>
+      <w:tblPr>
+        <w:tblW w:type="auto" w:w="0"/>
+        <w:jc w:val="center"/>
+        <w:tblLayout w:type="fixed"/>
+        <w:tblLook w:firstColumn="1" w:firstRow="1" w:lastColumn="0" w:lastRow="0" w:noHBand="0" w:noVBand="1" w:val="04A0"/>
+      </w:tblPr>
+      <w:tblGrid>
+        <w:gridCol w:w="4680"/>
+        <w:gridCol w:w="4680"/>
+      </w:tblGrid>
+      <w:tr>
+        <w:tc>
+          <w:tcPr>
+            <w:tcW w:type="dxa" w:w="4608"/>
+            <w:tcMar>
+              <w:top w:w="60" w:type="dxa"/>
+              <w:bottom w:w="60" w:type="dxa"/>
+              <w:left w:w="60" w:type="dxa"/>
+              <w:right w:w="60" w:type="dxa"/>
+            </w:tcMar>
+          </w:tcPr>
+          <w:p>
+            <w:pPr>
+              <w:jc w:val="center"/>
+            </w:pPr>
+            <w:r>
+              <w:drawing>
+                <wp:inline xmlns:a="http://schemas.openxmlformats.org/drawingml/2006/main" xmlns:pic="http://schemas.openxmlformats.org/drawingml/2006/picture">
+                  <wp:extent cx="2468880" cy="5486400"/>
+                  <wp:docPr id="1" name="Picture 1"/>
+                  <wp:cNvGraphicFramePr>
+                    <a:graphicFrameLocks noChangeAspect="1"/>
+                  </wp:cNvGraphicFramePr>
+                  <a:graphic>
+                    <a:graphicData uri="http://schemas.openxmlformats.org/drawingml/2006/picture">
+                      <pic:pic>
+                        <pic:nvPicPr>
+                          <pic:cNvPr id="0" name="screenshot_home.png"/>
+                          <pic:cNvPicPr/>
+                        </pic:nvPicPr>
+                        <pic:blipFill>
+                          <a:blip r:embed="rId9"/>
+                          <a:stretch>
+                            <a:fillRect/>
+                          </a:stretch>
+                        </pic:blipFill>
+                        <pic:spPr>
+                          <a:xfrm>
+                            <a:off x="0" y="0"/>
+                            <a:ext cx="2468880" cy="5486400"/>
+                          </a:xfrm>
+                          <a:prstGeom prst="rect"/>
+                        </pic:spPr>
+                      </pic:pic>
+                    </a:graphicData>
+                  </a:graphic>
+                </wp:inline>
+              </w:drawing>
+            </w:r>
+          </w:p>
+        </w:tc>
+        <w:tc>
+          <w:tcPr>
+            <w:tcW w:type="dxa" w:w="4608"/>
+            <w:tcMar>
+              <w:top w:w="60" w:type="dxa"/>
+              <w:bottom w:w="60" w:type="dxa"/>
+              <w:left w:w="60" w:type="dxa"/>
+              <w:right w:w="60" w:type="dxa"/>
+            </w:tcMar>
+          </w:tcPr>
+          <w:p>
+            <w:pPr>
+              <w:jc w:val="center"/>
+            </w:pPr>
+            <w:r>
+              <w:drawing>
+                <wp:inline xmlns:a="http://schemas.openxmlformats.org/drawingml/2006/main" xmlns:pic="http://schemas.openxmlformats.org/drawingml/2006/picture">
+                  <wp:extent cx="2468880" cy="5486400"/>
+                  <wp:docPr id="2" name="Picture 2"/>
+                  <wp:cNvGraphicFramePr>
+                    <a:graphicFrameLocks noChangeAspect="1"/>
+                  </wp:cNvGraphicFramePr>
+                  <a:graphic>
+                    <a:graphicData uri="http://schemas.openxmlformats.org/drawingml/2006/picture">
+                      <pic:pic>
+                        <pic:nvPicPr>
+                          <pic:cNvPr id="0" name="screenshot_dark_mode.png"/>
+                          <pic:cNvPicPr/>
+                        </pic:nvPicPr>
+                        <pic:blipFill>
+                          <a:blip r:embed="rId10"/>
+                          <a:stretch>
+                            <a:fillRect/>
+                          </a:stretch>
+                        </pic:blipFill>
+                        <pic:spPr>
+                          <a:xfrm>
+                            <a:off x="0" y="0"/>
+                            <a:ext cx="2468880" cy="5486400"/>
+                          </a:xfrm>
+                          <a:prstGeom prst="rect"/>
+                        </pic:spPr>
+                      </pic:pic>
+                    </a:graphicData>
+                  </a:graphic>
+                </wp:inline>
+              </w:drawing>
+            </w:r>
+          </w:p>
+        </w:tc>
+      </w:tr>
+      <w:tr>
+        <w:tc>
+          <w:tcPr>
+            <w:tcW w:type="dxa" w:w="4608"/>
+            <w:tcMar>
+              <w:top w:w="60" w:type="dxa"/>
+              <w:bottom w:w="60" w:type="dxa"/>
+              <w:left w:w="60" w:type="dxa"/>
+              <w:right w:w="60" w:type="dxa"/>
+            </w:tcMar>
+          </w:tcPr>
+          <w:p>
+            <w:pPr>
+              <w:jc w:val="center"/>
+            </w:pPr>
+            <w:r>
+              <w:rPr>
+                <w:b/>
+                <w:color w:val="0F4C81"/>
+                <w:sz w:val="19"/>
+              </w:rPr>
+              <w:t>Hình 1: Màn hình Trang chủ (Chế độ Sáng)</w:t>
+              <w:br/>
+              <w:t>Danh sách tin tức &amp; FilterChip chuyên mục</w:t>
+            </w:r>
+          </w:p>
+        </w:tc>
+        <w:tc>
+          <w:tcPr>
+            <w:tcW w:type="dxa" w:w="4608"/>
+            <w:tcMar>
+              <w:top w:w="60" w:type="dxa"/>
+              <w:bottom w:w="60" w:type="dxa"/>
+              <w:left w:w="60" w:type="dxa"/>
+              <w:right w:w="60" w:type="dxa"/>
+            </w:tcMar>
+          </w:tcPr>
+          <w:p>
+            <w:pPr>
+              <w:jc w:val="center"/>
+            </w:pPr>
+            <w:r>
+              <w:rPr>
+                <w:b/>
+                <w:color w:val="0F4C81"/>
+                <w:sz w:val="19"/>
+              </w:rPr>
+              <w:t>Hình 2: Chế độ Giao diện Tối (Dark Mode)</w:t>
+              <w:br/>
+              <w:t>Lưu trạng thái giao diện qua DataStore Preferences</w:t>
             </w:r>
           </w:p>
         </w:tc>
@@ -835,12 +1029,185 @@
     </w:tbl>
     <w:p>
       <w:pPr>
-        <w:spacing w:after="200"/>
+        <w:spacing w:after="240"/>
       </w:pPr>
+    </w:p>
+    <w:tbl>
+      <w:tblPr>
+        <w:tblW w:type="auto" w:w="0"/>
+        <w:jc w:val="center"/>
+        <w:tblLayout w:type="fixed"/>
+        <w:tblLook w:firstColumn="1" w:firstRow="1" w:lastColumn="0" w:lastRow="0" w:noHBand="0" w:noVBand="1" w:val="04A0"/>
+      </w:tblPr>
+      <w:tblGrid>
+        <w:gridCol w:w="4680"/>
+        <w:gridCol w:w="4680"/>
+      </w:tblGrid>
+      <w:tr>
+        <w:tc>
+          <w:tcPr>
+            <w:tcW w:type="dxa" w:w="4608"/>
+            <w:tcMar>
+              <w:top w:w="60" w:type="dxa"/>
+              <w:bottom w:w="60" w:type="dxa"/>
+              <w:left w:w="60" w:type="dxa"/>
+              <w:right w:w="60" w:type="dxa"/>
+            </w:tcMar>
+          </w:tcPr>
+          <w:p>
+            <w:pPr>
+              <w:jc w:val="center"/>
+            </w:pPr>
+            <w:r>
+              <w:drawing>
+                <wp:inline xmlns:a="http://schemas.openxmlformats.org/drawingml/2006/main" xmlns:pic="http://schemas.openxmlformats.org/drawingml/2006/picture">
+                  <wp:extent cx="2468880" cy="5486400"/>
+                  <wp:docPr id="3" name="Picture 3"/>
+                  <wp:cNvGraphicFramePr>
+                    <a:graphicFrameLocks noChangeAspect="1"/>
+                  </wp:cNvGraphicFramePr>
+                  <a:graphic>
+                    <a:graphicData uri="http://schemas.openxmlformats.org/drawingml/2006/picture">
+                      <pic:pic>
+                        <pic:nvPicPr>
+                          <pic:cNvPr id="0" name="screenshot_detail.png"/>
+                          <pic:cNvPicPr/>
+                        </pic:nvPicPr>
+                        <pic:blipFill>
+                          <a:blip r:embed="rId11"/>
+                          <a:stretch>
+                            <a:fillRect/>
+                          </a:stretch>
+                        </pic:blipFill>
+                        <pic:spPr>
+                          <a:xfrm>
+                            <a:off x="0" y="0"/>
+                            <a:ext cx="2468880" cy="5486400"/>
+                          </a:xfrm>
+                          <a:prstGeom prst="rect"/>
+                        </pic:spPr>
+                      </pic:pic>
+                    </a:graphicData>
+                  </a:graphic>
+                </wp:inline>
+              </w:drawing>
+            </w:r>
+          </w:p>
+        </w:tc>
+        <w:tc>
+          <w:tcPr>
+            <w:tcW w:type="dxa" w:w="4608"/>
+            <w:tcMar>
+              <w:top w:w="60" w:type="dxa"/>
+              <w:bottom w:w="60" w:type="dxa"/>
+              <w:left w:w="60" w:type="dxa"/>
+              <w:right w:w="60" w:type="dxa"/>
+            </w:tcMar>
+          </w:tcPr>
+          <w:p>
+            <w:pPr>
+              <w:jc w:val="center"/>
+            </w:pPr>
+            <w:r>
+              <w:drawing>
+                <wp:inline xmlns:a="http://schemas.openxmlformats.org/drawingml/2006/main" xmlns:pic="http://schemas.openxmlformats.org/drawingml/2006/picture">
+                  <wp:extent cx="2468880" cy="5486400"/>
+                  <wp:docPr id="4" name="Picture 4"/>
+                  <wp:cNvGraphicFramePr>
+                    <a:graphicFrameLocks noChangeAspect="1"/>
+                  </wp:cNvGraphicFramePr>
+                  <a:graphic>
+                    <a:graphicData uri="http://schemas.openxmlformats.org/drawingml/2006/picture">
+                      <pic:pic>
+                        <pic:nvPicPr>
+                          <pic:cNvPr id="0" name="screenshot_bookmarks.png"/>
+                          <pic:cNvPicPr/>
+                        </pic:nvPicPr>
+                        <pic:blipFill>
+                          <a:blip r:embed="rId12"/>
+                          <a:stretch>
+                            <a:fillRect/>
+                          </a:stretch>
+                        </pic:blipFill>
+                        <pic:spPr>
+                          <a:xfrm>
+                            <a:off x="0" y="0"/>
+                            <a:ext cx="2468880" cy="5486400"/>
+                          </a:xfrm>
+                          <a:prstGeom prst="rect"/>
+                        </pic:spPr>
+                      </pic:pic>
+                    </a:graphicData>
+                  </a:graphic>
+                </wp:inline>
+              </w:drawing>
+            </w:r>
+          </w:p>
+        </w:tc>
+      </w:tr>
+      <w:tr>
+        <w:tc>
+          <w:tcPr>
+            <w:tcW w:type="dxa" w:w="4608"/>
+            <w:tcMar>
+              <w:top w:w="60" w:type="dxa"/>
+              <w:bottom w:w="60" w:type="dxa"/>
+              <w:left w:w="60" w:type="dxa"/>
+              <w:right w:w="60" w:type="dxa"/>
+            </w:tcMar>
+          </w:tcPr>
+          <w:p>
+            <w:pPr>
+              <w:jc w:val="center"/>
+            </w:pPr>
+            <w:r>
+              <w:rPr>
+                <w:b/>
+                <w:color w:val="0F4C81"/>
+                <w:sz w:val="19"/>
+              </w:rPr>
+              <w:t>Hình 3: Màn hình Đọc báo gốc (AndroidView WebView)</w:t>
+              <w:br/>
+              <w:t>Hiển thị tràn viền 100%, có BackHandler và thanh tiến trình</w:t>
+            </w:r>
+          </w:p>
+        </w:tc>
+        <w:tc>
+          <w:tcPr>
+            <w:tcW w:type="dxa" w:w="4608"/>
+            <w:tcMar>
+              <w:top w:w="60" w:type="dxa"/>
+              <w:bottom w:w="60" w:type="dxa"/>
+              <w:left w:w="60" w:type="dxa"/>
+              <w:right w:w="60" w:type="dxa"/>
+            </w:tcMar>
+          </w:tcPr>
+          <w:p>
+            <w:pPr>
+              <w:jc w:val="center"/>
+            </w:pPr>
+            <w:r>
+              <w:rPr>
+                <w:b/>
+                <w:color w:val="0F4C81"/>
+                <w:sz w:val="19"/>
+              </w:rPr>
+              <w:t>Hình 4: Màn hình Bài viết đã lưu (Bookmarks)</w:t>
+              <w:br/>
+              <w:t>Đọc ngoại tuyến từ Room Database kể cả khi ngắt mạng</w:t>
+            </w:r>
+          </w:p>
+        </w:tc>
+      </w:tr>
+    </w:tbl>
+    <w:p>
+      <w:r>
+        <w:br w:type="page"/>
+      </w:r>
     </w:p>
     <w:p>
       <w:pPr>
-        <w:spacing w:before="280" w:after="120"/>
+        <w:spacing w:before="320" w:after="120"/>
       </w:pPr>
       <w:r>
         <w:rPr>
@@ -848,12 +1215,12 @@
           <w:color w:val="0F4C81"/>
           <w:sz w:val="30"/>
         </w:rPr>
-        <w:t>3. THIẾT KẾ KIẾN TRÚC &amp; TỔ CHỨC MÃ NGUỒN</w:t>
+        <w:t>4. THIẾT KẾ KIẾN TRÚC &amp; CHI TIẾT TÍNH NĂNG</w:t>
       </w:r>
     </w:p>
     <w:p>
       <w:pPr>
-        <w:spacing w:before="200" w:after="80"/>
+        <w:spacing w:before="240" w:after="80"/>
       </w:pPr>
       <w:r>
         <w:rPr>
@@ -861,13 +1228,7 @@
           <w:color w:val="BA3224"/>
           <w:sz w:val="25"/>
         </w:rPr>
-        <w:t>3.1 Cấu trúc gói (Package Structure)</w:t>
-      </w:r>
-    </w:p>
-    <w:p>
-      <w:r>
-        <w:t>Dự án tuân thủ nghiêm ngặt nguyên tắc phân tách trách nhiệm (Separation of Concerns):</w:t>
-        <w:br/>
+        <w:t>4.1 Cấu trúc gói mã nguồn (Package Structure)</w:t>
       </w:r>
     </w:p>
     <w:tbl>
@@ -905,17 +1266,17 @@
               <w:br/>
               <w:t>├── data/</w:t>
               <w:br/>
-              <w:t>│   ├── local/               # [Unit 6] Room DB (Entity, DAO, Converters) &amp; DataStore</w:t>
+              <w:t>│   ├── local/               # [Unit 6] Room DB (AppDatabase, ArticleDao, Entity, Converters) &amp; DataStore</w:t>
               <w:br/>
-              <w:t>│   ├── remote/              # [Unit 5] Retrofit DTO, NewsApiService (rss2json)</w:t>
+              <w:t>│   ├── remote/              # [Unit 5] NewsApiService, VnExpressRssParser (XML Pull Parser), DTO</w:t>
               <w:br/>
               <w:t>│   ├── repository/          # [Unit 4] NewsRepository, NetworkNewsRepository</w:t>
               <w:br/>
-              <w:t>│   └── AppContainer.kt      # Manual Dependency Injection (AppContainer Pattern)</w:t>
+              <w:t>│   └── AppContainer.kt      # Dependency Injection theo mẫu Google AppContainer</w:t>
               <w:br/>
               <w:t>├── ui/</w:t>
               <w:br/>
-              <w:t>│   ├── bookmarks/           # Màn hình bài viết đã lưu offline</w:t>
+              <w:t>│   ├── bookmarks/           # Màn hình bài viết đã lưu offline (BookmarksScreen, ViewModel)</w:t>
               <w:br/>
               <w:t>│   ├── detail/              # [Unit 8] Màn hình đọc bài báo gốc qua ArticleWebView</w:t>
               <w:br/>
@@ -923,15 +1284,15 @@
               <w:br/>
               <w:t>│   ├── navigation/          # Jetpack Navigation Compose (NewsNavGraph, Destinations)</w:t>
               <w:br/>
-              <w:t>│   └── theme/               # Material 3 Dynamic Theme &amp; Typography</w:t>
+              <w:t>│   └── theme/               # Material 3 Theme, Typography và Color Scheme</w:t>
               <w:br/>
-              <w:t>├── worker/                  # [Unit 7] DailyNewsNotificationWorker</w:t>
+              <w:t>├── worker/                  # [Unit 7] DailyNewsNotificationWorker (PeriodicWorkRequest)</w:t>
               <w:br/>
-              <w:t>├── MainActivity.kt          # Host Activity, Edge-to-Edge, Runtime Permissions</w:t>
+              <w:t>├── MainActivity.kt          # Activity chính, Edge-to-Edge, Runtime Permissions Android 13+</w:t>
               <w:br/>
               <w:t>├── MainViewModel.kt         # Quản lý trạng thái theme và cài đặt ứng dụng</w:t>
               <w:br/>
-              <w:t>└── NewsApplication.kt       # Application class khởi tạo Container và WorkManager</w:t>
+              <w:t>└── NewsApplication.kt       # Application class khởi tạo Container và thiết lập Worker</w:t>
             </w:r>
           </w:p>
         </w:tc>
@@ -944,7 +1305,7 @@
     </w:p>
     <w:p>
       <w:pPr>
-        <w:spacing w:before="200" w:after="80"/>
+        <w:spacing w:before="240" w:after="80"/>
       </w:pPr>
       <w:r>
         <w:rPr>
@@ -952,34 +1313,19 @@
           <w:color w:val="BA3224"/>
           <w:sz w:val="25"/>
         </w:rPr>
-        <w:t>3.2 Cơ chế dữ liệu ngoại tuyến (Offline-First Data Flow)</w:t>
+        <w:t>4.2 Cơ chế phân tách dữ liệu và luồng phản ứng (UDF)</w:t>
       </w:r>
     </w:p>
     <w:p>
       <w:r>
-        <w:t>• Khi có kết nối mạng: Retrofit nạp danh sách tin từ các nguồn RSS VnExpress thông qua cầu nối JSON. Người dùng duyệt bài đọc với hình ảnh tải mượt qua bộ đệm Coil.</w:t>
+        <w:t>• Unidirectional Data Flow (UDF): Toàn bộ trạng thái giao diện được đóng gói thành lớp sealed `HomeUiState` (Loading, Success, Error). Giao diện phát ra sự kiện (Event) tới ViewModel, ViewModel cập nhật dữ liệu và phát ra StateFlow mới để Composable tự động tái tạo (Recomposition).</w:t>
         <w:br/>
-        <w:t>• Tính năng Lưu bài viết (Bookmark): Bài viết được lưu nguyên vẹn vào Room Database (`articles` table). Mỗi khi người dùng lưu hoặc xóa, Flow từ DAO tự động phát tín hiệu cập nhật UI tức thì.</w:t>
-        <w:br/>
-        <w:t>• Khi ngắt mạng (Offline): Màn hình 'Đã lưu' đọc trực tiếp từ Room Database, người dùng vẫn có thể xem lại toàn bộ danh sách bài viết đã lưu mà không bị gián đoạn.</w:t>
+        <w:t>• Luồng ngoại tuyến (Offline-First): Khi có mạng, Retrofit và OkHttp nạp dữ liệu trực tiếp từ các luồng RSS chính thức của VnExpress. Khi người dùng nhấn Bookmark, dữ liệu lập tức ghi vào Room Database. Khi mất kết nối mạng, màn hình Bookmark vẫn hoạt động trơn tru nhờ luồng Flow phản ứng từ Room DAO.</w:t>
       </w:r>
     </w:p>
     <w:p>
       <w:pPr>
-        <w:spacing w:before="280" w:after="120"/>
-      </w:pPr>
-      <w:r>
-        <w:rPr>
-          <w:b/>
-          <w:color w:val="0F4C81"/>
-          <w:sz w:val="30"/>
-        </w:rPr>
-        <w:t>4. CHI TIẾT CÁC TÍNH NĂNG VÀ MÀN HÌNH</w:t>
-      </w:r>
-    </w:p>
-    <w:p>
-      <w:pPr>
-        <w:spacing w:before="200" w:after="80"/>
+        <w:spacing w:before="240" w:after="80"/>
       </w:pPr>
       <w:r>
         <w:rPr>
@@ -987,87 +1333,21 @@
           <w:color w:val="BA3224"/>
           <w:sz w:val="25"/>
         </w:rPr>
-        <w:t>4.1 Màn hình Trang chủ (HomeScreen)</w:t>
+        <w:t>4.3 Tác vụ nền &amp; Thông báo định kỳ (Unit 7 WorkManager)</w:t>
       </w:r>
     </w:p>
     <w:p>
       <w:r>
-        <w:t>• Thanh lọc chuyên mục dạng FilterChip: Hỗ trợ 5 chuyên mục lớn gồm 'Mới nhất', 'Công nghệ', 'Kinh doanh', 'Thể thao', 'Giải trí'. Khi người dùng chuyển tab, ViewModel kích hoạt tải tin theo URL tương ứng.</w:t>
+        <w:t>• Sử dụng `PeriodicWorkRequestBuilder` chu kỳ lặp lại 12 giờ một lần.</w:t>
         <w:br/>
-        <w:t>• Xử lý 3 trạng thái giao diện chuẩn (UiState): Loading (Vòng xoay tiến trình), Success (Hiển thị thẻ bài viết), Error (Thông báo lỗi mất mạng kèm nút 'Thử lại').</w:t>
+        <w:t>• Ràng buộc thông minh `NetworkType.CONNECTED`: Tiết kiệm tối đa pin và dữ liệu, chỉ chạy khi thiết bị đã kết nối mạng.</w:t>
         <w:br/>
-        <w:t>• Thẻ bài viết (ArticleCard): Tích hợp hiển thị ảnh thumbnail, tiêu đề in đậm, đoạn trích lược bỏ thẻ HTML, thời gian xuất bản và nút Bookmark phản ứng lập tức.</w:t>
+        <w:t>• Tương thích Android 13+ (API 33+): MainActivity tự động kiểm tra và yêu cầu quyền `POST_NOTIFICATIONS` khi khởi động ứng dụng.</w:t>
       </w:r>
     </w:p>
     <w:p>
       <w:pPr>
-        <w:spacing w:before="200" w:after="80"/>
-      </w:pPr>
-      <w:r>
-        <w:rPr>
-          <w:b/>
-          <w:color w:val="BA3224"/>
-          <w:sz w:val="25"/>
-        </w:rPr>
-        <w:t>4.2 Màn hình Đọc bài báo gốc (DetailScreen &amp; ArticleWebView)</w:t>
-      </w:r>
-    </w:p>
-    <w:p>
-      <w:r>
-        <w:t>• Áp dụng kỹ thuật Interoperability của Unit 8: Sử dụng `AndroidView` nhúng đối tượng `android.webkit.WebView`.</w:t>
-        <w:br/>
-        <w:t>• Cho phép người dùng trải nghiệm nguyên vẹn bài viết trên website VnExpress ngay trong ứng dụng.</w:t>
-        <w:br/>
-        <w:t>• Hỗ trợ WebChromeClient hiển thị thanh tiến trình tải trang và tích hợp `BackHandler` của Compose giúp người dùng nhấn phím Back lùi lại lịch sử trang web thay vì bị văng khỏi màn hình.</w:t>
-      </w:r>
-    </w:p>
-    <w:p>
-      <w:pPr>
-        <w:spacing w:before="200" w:after="80"/>
-      </w:pPr>
-      <w:r>
-        <w:rPr>
-          <w:b/>
-          <w:color w:val="BA3224"/>
-          <w:sz w:val="25"/>
-        </w:rPr>
-        <w:t>4.3 Màn hình Tin đã lưu (BookmarksScreen)</w:t>
-      </w:r>
-    </w:p>
-    <w:p>
-      <w:r>
-        <w:t>• Lấy nguồn dữ liệu từ Room Database dưới dạng `Flow&lt;List&lt;ArticleEntity&gt;&gt;`.</w:t>
-        <w:br/>
-        <w:t>• Cho phép xóa bài viết khỏi danh sách bookmark bằng 1 lần chạm.</w:t>
-        <w:br/>
-        <w:t>• Xử lý trạng thái trống (Empty State) với thông điệp hướng dẫn trực quan khi chưa có bài báo nào được lưu.</w:t>
-      </w:r>
-    </w:p>
-    <w:p>
-      <w:pPr>
-        <w:spacing w:before="200" w:after="80"/>
-      </w:pPr>
-      <w:r>
-        <w:rPr>
-          <w:b/>
-          <w:color w:val="BA3224"/>
-          <w:sz w:val="25"/>
-        </w:rPr>
-        <w:t>4.4 Tác vụ nền &amp; Thông báo định kỳ (WorkManager)</w:t>
-      </w:r>
-    </w:p>
-    <w:p>
-      <w:r>
-        <w:t>• Sử dụng `PeriodicWorkRequestBuilder` chu kỳ 12 giờ một lần.</w:t>
-        <w:br/>
-        <w:t>• Thiết lập ràng buộc `NetworkType.CONNECTED` nhằm tiết kiệm pin và dữ liệu, chỉ kích hoạt khi thiết bị có mạng.</w:t>
-        <w:br/>
-        <w:t>• Tương thích hoàn toàn với Android 13+ (API 33+) nhờ cơ chế kiểm tra và yêu cầu quyền `POST_NOTIFICATIONS` lúc runtime.</w:t>
-      </w:r>
-    </w:p>
-    <w:p>
-      <w:pPr>
-        <w:spacing w:before="280" w:after="120"/>
+        <w:spacing w:before="320" w:after="120"/>
       </w:pPr>
       <w:r>
         <w:rPr>
@@ -1080,7 +1360,7 @@
     </w:p>
     <w:p>
       <w:pPr>
-        <w:spacing w:before="200" w:after="80"/>
+        <w:spacing w:before="240" w:after="80"/>
       </w:pPr>
       <w:r>
         <w:rPr>
@@ -1088,12 +1368,12 @@
           <w:color w:val="BA3224"/>
           <w:sz w:val="25"/>
         </w:rPr>
-        <w:t>5.1 Kết quả kiểm thử tự động (Unit Testing)</w:t>
+        <w:t>5.1 Báo cáo kiểm thử đơn vị (55/55 Test Cases PASS)</w:t>
       </w:r>
     </w:p>
     <w:p>
       <w:r>
-        <w:t>Dự án được trang bị bộ kiểm thử đơn vị toàn diện nằm trong thư mục `app/src/test/`, sử dụng JUnit 4, Kotlinx Coroutines Test, và hệ thống Fake Test Doubles:</w:t>
+        <w:t>Dự án được xây dựng với phương pháp kiểm thử tự động toàn diện trong `app/src/test/`, đảm bảo không xảy ra lỗi hồi quy:</w:t>
       </w:r>
     </w:p>
     <w:tbl>
@@ -1149,7 +1429,7 @@
                 <w:color w:val="FFFFFF"/>
                 <w:sz w:val="19"/>
               </w:rPr>
-              <w:t>Nội dung &amp; Đối tượng kiểm thử</w:t>
+              <w:t>Đối tượng &amp; Hành vi kiểm thử</w:t>
             </w:r>
           </w:p>
         </w:tc>
@@ -1213,7 +1493,7 @@
               <w:rPr>
                 <w:sz w:val="18"/>
               </w:rPr>
-              <w:t>Kiểm thử trạng thái StateFlow, tải tin, chuyển chuyên mục, bookmark</w:t>
+              <w:t>Kiểm thử phát StateFlow (Loading/Success/Error), chọn danh mục, retry</w:t>
             </w:r>
           </w:p>
         </w:tc>
@@ -1277,7 +1557,7 @@
               <w:rPr>
                 <w:sz w:val="18"/>
               </w:rPr>
-              <w:t>Kiểm thử luồng dữ liệu Room Flow và xóa bài viết khỏi mục đã lưu</w:t>
+              <w:t>Kiểm thử luồng Room reactive Flow và xóa bài viết khỏi DB</w:t>
             </w:r>
           </w:p>
         </w:tc>
@@ -1341,7 +1621,7 @@
               <w:rPr>
                 <w:sz w:val="18"/>
               </w:rPr>
-              <w:t>Kiểm thử Retrofit DTO mapping, fallback trích xuất ảnh thumbnail</w:t>
+              <w:t>Kiểm thử ánh xạ RSS DTO, fallback trích xuất ảnh thumbnail</w:t>
             </w:r>
           </w:p>
         </w:tc>
@@ -1405,7 +1685,7 @@
               <w:rPr>
                 <w:sz w:val="18"/>
               </w:rPr>
-              <w:t>Kiểm thử Room TypeConverters chuyển đổi dữ liệu an toàn</w:t>
+              <w:t>Kiểm thử Room TypeConverters chuyển đổi kiểu dữ liệu an toàn</w:t>
             </w:r>
           </w:p>
         </w:tc>
@@ -1440,7 +1720,7 @@
     </w:p>
     <w:p>
       <w:pPr>
-        <w:spacing w:before="200" w:after="80"/>
+        <w:spacing w:before="240" w:after="80"/>
       </w:pPr>
       <w:r>
         <w:rPr>
@@ -1448,21 +1728,21 @@
           <w:color w:val="BA3224"/>
           <w:sz w:val="25"/>
         </w:rPr>
-        <w:t>5.2 Đóng gói file cài đặt APK &amp; Phát hành GitHub Release</w:t>
+        <w:t>5.2 Đóng gói file APK &amp; Phát hành trên GitHub</w:t>
       </w:r>
     </w:p>
     <w:p>
       <w:r>
-        <w:t>• Dự án được biên dịch hoàn tất qua lệnh `./gradlew assembleDebug`.</w:t>
+        <w:t>• Toàn bộ mã nguồn dự án được đồng bộ và quản lý phiên bản trên GitHub: https://github.com/kurrukado/VnNews</w:t>
         <w:br/>
-        <w:t>• File cài đặt độc lập: `app-debug.apk` (Dung lượng 26.5 MB), có thể cài đặt trực tiếp trên mọi thiết bị Android 8.0 trở lên.</w:t>
+        <w:t>• Bản phát hành Release v1.0.0 đã đính kèm trực tiếp file APK hoàn chỉnh: https://github.com/kurrukado/VnNews/releases/tag/v1.0.0</w:t>
         <w:br/>
-        <w:t>• Mã nguồn và bản phát hành được đồng bộ đầy đủ trên GitHub: https://github.com/kurrukado/VnNews/releases/tag/v1.0.0.</w:t>
+        <w:t>• Đường dẫn file APK trên máy tính: `D:\VnNews\app\build\outputs\apk\debug\app-debug.apk` (Dung lượng 26.5 MB, cài đặt trực tiếp không cần mạng để mở).</w:t>
       </w:r>
     </w:p>
     <w:p>
       <w:pPr>
-        <w:spacing w:before="280" w:after="120"/>
+        <w:spacing w:before="320" w:after="120"/>
       </w:pPr>
       <w:r>
         <w:rPr>
@@ -1470,20 +1750,20 @@
           <w:color w:val="0F4C81"/>
           <w:sz w:val="30"/>
         </w:rPr>
-        <w:t>6. KẾT LUẬN &amp; ĐÁNH GIÁ</w:t>
+        <w:t>6. KẾT LUẬN</w:t>
       </w:r>
     </w:p>
     <w:p>
       <w:r>
-        <w:t>Đồ án ứng dụng đọc báo VnNews đã hoàn thành xuất sắc 100% các tiêu chí kỹ thuật đặt ra:</w:t>
+        <w:t>Đề tài xây dựng ứng dụng VnNews (VnExpress Reader) đã hoàn thành xuất sắc 100% mục tiêu đề ra cho bài thi 30%:</w:t>
         <w:br/>
-        <w:t>1. Kiến trúc hiện đại, rõ ràng, dễ bảo trì và mở rộng.</w:t>
+        <w:t>1. Hiện thực hóa đầy đủ và chính xác toàn bộ kiến thức Units 4 đến 8 của Google Android Basics with Compose.</w:t>
         <w:br/>
-        <w:t>2. Đạt độ ổn định cao với 55 test cases kiểm thử tự động thành công.</w:t>
+        <w:t>2. Mã nguồn chuẩn chỉ, kiểm thử 55 test cases tự động đạt tỉ lệ thành công 100%.</w:t>
         <w:br/>
-        <w:t>3. Trải nghiệm người dùng mượt mà, đầy đủ tính năng đọc báo trực tuyến, ngoại tuyến và thông báo nền.</w:t>
+        <w:t>3. Giao diện thực tế đẹp mắt, mượt mà, hỗ trợ cả chế độ Sáng/Tối và đọc ngoại tuyến.</w:t>
         <w:br/>
-        <w:t>4. Minh chứng đầy đủ sản phẩm gồm mã nguồn trên GitHub và file cài đặt APK sẵn sàng nghiệm thu.</w:t>
+        <w:t>4. Sản phẩm hoàn thiện có thể cài đặt và nghiệm thu ngay trên thiết bị Android thật.</w:t>
       </w:r>
     </w:p>
     <w:sectPr>

</xml_diff>